<commit_message>
se update in Varguid.R
</commit_message>
<xml_diff>
--- a/plots and tables/all simulation res.docx
+++ b/plots and tables/all simulation res.docx
@@ -4,10 +4,18 @@
   <w:body>
     <w:p>
       <w:r>
-        <w:t>Original simulation</w:t>
-      </w:r>
-      <w:r>
-        <w:t>(long time)</w:t>
+        <w:t xml:space="preserve">Original </w:t>
+      </w:r>
+      <w:proofErr w:type="gramStart"/>
+      <w:r>
+        <w:t>simulation</w:t>
+      </w:r>
+      <w:r>
+        <w:t>(</w:t>
+      </w:r>
+      <w:proofErr w:type="gramEnd"/>
+      <w:r>
+        <w:t>long time)</w:t>
       </w:r>
       <w:r>
         <w:t>:</w:t>
@@ -45,10 +53,10 @@
             <v:path o:extrusionok="f" gradientshapeok="t" o:connecttype="rect"/>
             <o:lock v:ext="edit" aspectratio="t"/>
           </v:shapetype>
-          <v:shape id="_x0000_i1025" type="#_x0000_t75" alt="" style="width:468pt;height:14.7pt;mso-width-percent:0;mso-height-percent:0;mso-width-percent:0;mso-height-percent:0" o:ole="">
+          <v:shape id="_x0000_i1025" type="#_x0000_t75" alt="" style="width:468pt;height:14.4pt;mso-width-percent:0;mso-height-percent:0;mso-width-percent:0;mso-height-percent:0" o:ole="">
             <v:imagedata r:id="rId4" o:title=""/>
           </v:shape>
-          <o:OLEObject Type="Embed" ProgID="Word.Document.12" ShapeID="_x0000_i1025" DrawAspect="Content" ObjectID="_1773210971" r:id="rId5">
+          <o:OLEObject Type="Embed" ProgID="Word.Document.12" ShapeID="_x0000_i1025" DrawAspect="Content" ObjectID="_1773662472" r:id="rId5">
             <o:FieldCodes>\s</o:FieldCodes>
           </o:OLEObject>
         </w:object>
@@ -353,8 +361,8 @@
           <w:noProof/>
         </w:rPr>
         <w:drawing>
-          <wp:inline distT="0" distB="0" distL="0" distR="0" wp14:anchorId="3E26CC38" wp14:editId="6A3C5A84">
-            <wp:extent cx="5943600" cy="4653280"/>
+          <wp:inline distT="0" distB="0" distL="0" distR="0" wp14:anchorId="3E26CC38" wp14:editId="2B72CCDC">
+            <wp:extent cx="6654800" cy="5829300"/>
             <wp:effectExtent l="0" t="0" r="0" b="0"/>
             <wp:docPr id="8" name="Picture 8" descr="A group of graphs with numbers&#10;&#10;Description automatically generated with medium confidence"/>
             <wp:cNvGraphicFramePr>
@@ -382,7 +390,7 @@
                   <pic:spPr>
                     <a:xfrm>
                       <a:off x="0" y="0"/>
-                      <a:ext cx="5943600" cy="4653280"/>
+                      <a:ext cx="6654800" cy="5829300"/>
                     </a:xfrm>
                     <a:prstGeom prst="rect">
                       <a:avLst/>
@@ -399,9 +407,9 @@
           <w:noProof/>
         </w:rPr>
         <w:drawing>
-          <wp:inline distT="0" distB="0" distL="0" distR="0" wp14:anchorId="798A9B69" wp14:editId="1FA9A799">
-            <wp:extent cx="2413000" cy="762000"/>
-            <wp:effectExtent l="0" t="0" r="0" b="0"/>
+          <wp:inline distT="0" distB="0" distL="0" distR="0" wp14:anchorId="798A9B69" wp14:editId="7F460464">
+            <wp:extent cx="5750983" cy="1816100"/>
+            <wp:effectExtent l="0" t="0" r="2540" b="0"/>
             <wp:docPr id="9" name="Picture 9" descr="A number of numbers on a white background&#10;&#10;Description automatically generated"/>
             <wp:cNvGraphicFramePr>
               <a:graphicFrameLocks xmlns:a="http://schemas.openxmlformats.org/drawingml/2006/main" noChangeAspect="1"/>
@@ -428,7 +436,7 @@
                   <pic:spPr>
                     <a:xfrm>
                       <a:off x="0" y="0"/>
-                      <a:ext cx="2413000" cy="762000"/>
+                      <a:ext cx="5758297" cy="1818410"/>
                     </a:xfrm>
                     <a:prstGeom prst="rect">
                       <a:avLst/>
@@ -452,9 +460,9 @@
           <w:noProof/>
         </w:rPr>
         <w:drawing>
-          <wp:inline distT="0" distB="0" distL="0" distR="0" wp14:anchorId="349101B8" wp14:editId="77A49307">
-            <wp:extent cx="5943600" cy="4482465"/>
-            <wp:effectExtent l="0" t="0" r="0" b="635"/>
+          <wp:inline distT="0" distB="0" distL="0" distR="0" wp14:anchorId="349101B8" wp14:editId="0A8A424C">
+            <wp:extent cx="6584354" cy="4965700"/>
+            <wp:effectExtent l="0" t="0" r="0" b="0"/>
             <wp:docPr id="10" name="Picture 10" descr="A group of black and white graphs&#10;&#10;Description automatically generated"/>
             <wp:cNvGraphicFramePr>
               <a:graphicFrameLocks xmlns:a="http://schemas.openxmlformats.org/drawingml/2006/main" noChangeAspect="1"/>
@@ -481,7 +489,7 @@
                   <pic:spPr>
                     <a:xfrm>
                       <a:off x="0" y="0"/>
-                      <a:ext cx="5943600" cy="4482465"/>
+                      <a:ext cx="6591704" cy="4971243"/>
                     </a:xfrm>
                     <a:prstGeom prst="rect">
                       <a:avLst/>
@@ -498,9 +506,9 @@
           <w:noProof/>
         </w:rPr>
         <w:drawing>
-          <wp:inline distT="0" distB="0" distL="0" distR="0" wp14:anchorId="72150C93" wp14:editId="396CAD17">
-            <wp:extent cx="2527300" cy="1422400"/>
-            <wp:effectExtent l="0" t="0" r="0" b="0"/>
+          <wp:inline distT="0" distB="0" distL="0" distR="0" wp14:anchorId="72150C93" wp14:editId="6D1CA830">
+            <wp:extent cx="3234615" cy="1820487"/>
+            <wp:effectExtent l="0" t="0" r="4445" b="0"/>
             <wp:docPr id="11" name="Picture 11" descr="A number on a white background&#10;&#10;Description automatically generated"/>
             <wp:cNvGraphicFramePr>
               <a:graphicFrameLocks xmlns:a="http://schemas.openxmlformats.org/drawingml/2006/main" noChangeAspect="1"/>
@@ -527,7 +535,7 @@
                   <pic:spPr>
                     <a:xfrm>
                       <a:off x="0" y="0"/>
-                      <a:ext cx="2527300" cy="1422400"/>
+                      <a:ext cx="3252883" cy="1830768"/>
                     </a:xfrm>
                     <a:prstGeom prst="rect">
                       <a:avLst/>
@@ -708,9 +716,9 @@
           <w:noProof/>
         </w:rPr>
         <w:drawing>
-          <wp:inline distT="0" distB="0" distL="0" distR="0" wp14:anchorId="505A1EC0" wp14:editId="27A424F4">
-            <wp:extent cx="2438400" cy="927100"/>
-            <wp:effectExtent l="0" t="0" r="0" b="0"/>
+          <wp:inline distT="0" distB="0" distL="0" distR="0" wp14:anchorId="505A1EC0" wp14:editId="451D801F">
+            <wp:extent cx="3432589" cy="1305099"/>
+            <wp:effectExtent l="0" t="0" r="0" b="3175"/>
             <wp:docPr id="17" name="Picture 17" descr="A table with numbers and symbols&#10;&#10;Description automatically generated"/>
             <wp:cNvGraphicFramePr>
               <a:graphicFrameLocks xmlns:a="http://schemas.openxmlformats.org/drawingml/2006/main" noChangeAspect="1"/>
@@ -737,7 +745,7 @@
                   <pic:spPr>
                     <a:xfrm>
                       <a:off x="0" y="0"/>
-                      <a:ext cx="2438400" cy="927100"/>
+                      <a:ext cx="3469400" cy="1319095"/>
                     </a:xfrm>
                     <a:prstGeom prst="rect">
                       <a:avLst/>
@@ -862,13 +870,7 @@
     <w:p/>
     <w:p>
       <w:r>
-        <w:t>From Dr. Lu’s code on 2</w:t>
-      </w:r>
-      <w:r>
-        <w:t>9</w:t>
-      </w:r>
-      <w:r>
-        <w:t xml:space="preserve"> March</w:t>
+        <w:t>From Dr. Lu’s code on 29 March</w:t>
       </w:r>
     </w:p>
     <w:p>

</xml_diff>